<commit_message>
Edit Report AVL-Tree and B-Tree
</commit_message>
<xml_diff>
--- a/doc/ใบงานเรื่อง โครงสร้างของต้นไม้ AVL-Tree และ B-Tree.docx
+++ b/doc/ใบงานเรื่อง โครงสร้างของต้นไม้ AVL-Tree และ B-Tree.docx
@@ -17,14 +17,53 @@
       </w:pPr>
       <w:r>
         <w:rPr>
-          <w:rFonts w:hint="default" w:ascii="TH SarabunPSK" w:hAnsi="TH SarabunPSK" w:eastAsia="TH SarabunPSK" w:cs="TH SarabunPSK"/>
-          <w:b w:val="0"/>
-          <w:bCs w:val="0"/>
-          <w:sz w:val="32"/>
-          <w:szCs w:val="32"/>
-          <w:lang w:val="en-US"/>
-        </w:rPr>
-        <w:t>ใบงานเรื่อง โครงสร้างของต้นไม้ AVL-Tree และ B-Tree</w:t>
+          <w:rFonts w:ascii="TH SarabunPSK" w:hAnsi="TH SarabunPSK" w:cs="TH SarabunPSK"/>
+          <w:sz w:val="32"/>
+          <w:szCs w:val="32"/>
+        </w:rPr>
+        <w:drawing>
+          <wp:inline distT="0" distB="0" distL="0" distR="0">
+            <wp:extent cx="1097915" cy="2004695"/>
+            <wp:effectExtent l="0" t="0" r="6985" b="14605"/>
+            <wp:docPr id="1488787663" name="Picture 1"/>
+            <wp:cNvGraphicFramePr>
+              <a:graphicFrameLocks xmlns:a="http://schemas.openxmlformats.org/drawingml/2006/main" noChangeAspect="1"/>
+            </wp:cNvGraphicFramePr>
+            <a:graphic xmlns:a="http://schemas.openxmlformats.org/drawingml/2006/main">
+              <a:graphicData uri="http://schemas.openxmlformats.org/drawingml/2006/picture">
+                <pic:pic xmlns:pic="http://schemas.openxmlformats.org/drawingml/2006/picture">
+                  <pic:nvPicPr>
+                    <pic:cNvPr id="1488787663" name="Picture 1"/>
+                    <pic:cNvPicPr>
+                      <a:picLocks noChangeAspect="1"/>
+                    </pic:cNvPicPr>
+                  </pic:nvPicPr>
+                  <pic:blipFill>
+                    <a:blip r:embed="rId10" cstate="print">
+                      <a:extLst>
+                        <a:ext uri="{28A0092B-C50C-407E-A947-70E740481C1C}">
+                          <a14:useLocalDpi xmlns:a14="http://schemas.microsoft.com/office/drawing/2010/main" val="0"/>
+                        </a:ext>
+                      </a:extLst>
+                    </a:blip>
+                    <a:stretch>
+                      <a:fillRect/>
+                    </a:stretch>
+                  </pic:blipFill>
+                  <pic:spPr>
+                    <a:xfrm>
+                      <a:off x="0" y="0"/>
+                      <a:ext cx="1098000" cy="2005200"/>
+                    </a:xfrm>
+                    <a:prstGeom prst="rect">
+                      <a:avLst/>
+                    </a:prstGeom>
+                  </pic:spPr>
+                </pic:pic>
+              </a:graphicData>
+            </a:graphic>
+          </wp:inline>
+        </w:drawing>
       </w:r>
     </w:p>
     <w:p>
@@ -49,7 +88,7 @@
           <w:szCs w:val="32"/>
           <w:lang w:val="en-US"/>
         </w:rPr>
-        <w:t xml:space="preserve"> </w:t>
+        <w:t>ใบงานเรื่อง โครงสร้างของต้นไม้ AVL-Tree และ B-Tree</w:t>
       </w:r>
     </w:p>
     <w:p>
@@ -115,17 +154,6 @@
           <w:lang w:val="en-US"/>
         </w:rPr>
       </w:pPr>
-      <w:r>
-        <w:rPr>
-          <w:rFonts w:hint="default" w:ascii="TH SarabunPSK" w:hAnsi="TH SarabunPSK" w:eastAsia="TH SarabunPSK" w:cs="TH SarabunPSK"/>
-          <w:b w:val="0"/>
-          <w:bCs w:val="0"/>
-          <w:sz w:val="32"/>
-          <w:szCs w:val="32"/>
-          <w:lang w:val="en-US"/>
-        </w:rPr>
-        <w:t>รหัส ENGCE124_SEC2</w:t>
-      </w:r>
     </w:p>
     <w:p>
       <w:pPr>
@@ -163,7 +191,7 @@
           <w:szCs w:val="32"/>
           <w:lang w:val="en-US"/>
         </w:rPr>
-        <w:t xml:space="preserve"> </w:t>
+        <w:t>เสนอ</w:t>
       </w:r>
     </w:p>
     <w:p>
@@ -188,7 +216,7 @@
           <w:szCs w:val="32"/>
           <w:lang w:val="en-US"/>
         </w:rPr>
-        <w:t>เสนอ</w:t>
+        <w:t>อาจารย์ ปิยพล ยืนยงสถาวร</w:t>
       </w:r>
     </w:p>
     <w:p>
@@ -213,7 +241,7 @@
           <w:szCs w:val="32"/>
           <w:lang w:val="en-US"/>
         </w:rPr>
-        <w:t>อาจารย์ ปิยพล ยืนยงสถาวร</w:t>
+        <w:t xml:space="preserve"> </w:t>
       </w:r>
     </w:p>
     <w:p>
@@ -221,9 +249,12 @@
         <w:spacing w:before="0" w:beforeAutospacing="0" w:after="160" w:afterAutospacing="0"/>
         <w:jc w:val="center"/>
         <w:rPr>
-          <w:rFonts w:hint="default" w:ascii="TH SarabunPSK" w:hAnsi="TH SarabunPSK" w:cs="TH SarabunPSK"/>
-          <w:sz w:val="32"/>
-          <w:szCs w:val="32"/>
+          <w:rFonts w:hint="default" w:ascii="TH SarabunPSK" w:hAnsi="TH SarabunPSK" w:eastAsia="TH SarabunPSK" w:cs="TH SarabunPSK"/>
+          <w:b w:val="0"/>
+          <w:bCs w:val="0"/>
+          <w:sz w:val="32"/>
+          <w:szCs w:val="32"/>
+          <w:lang w:val="en-US"/>
         </w:rPr>
       </w:pPr>
       <w:r>
@@ -237,6 +268,8 @@
         </w:rPr>
         <w:t xml:space="preserve"> </w:t>
       </w:r>
+      <w:bookmarkStart w:id="0" w:name="_GoBack"/>
+      <w:bookmarkEnd w:id="0"/>
     </w:p>
     <w:p>
       <w:pPr>
@@ -251,142 +284,6 @@
           <w:lang w:val="en-US"/>
         </w:rPr>
       </w:pPr>
-      <w:r>
-        <w:rPr>
-          <w:rFonts w:hint="default" w:ascii="TH SarabunPSK" w:hAnsi="TH SarabunPSK" w:eastAsia="TH SarabunPSK" w:cs="TH SarabunPSK"/>
-          <w:b w:val="0"/>
-          <w:bCs w:val="0"/>
-          <w:sz w:val="32"/>
-          <w:szCs w:val="32"/>
-          <w:lang w:val="en-US"/>
-        </w:rPr>
-        <w:t>ใบงานนี้เป็นส่วนหนึ่งของวิชา</w:t>
-      </w:r>
-    </w:p>
-    <w:p>
-      <w:pPr>
-        <w:spacing w:before="0" w:beforeAutospacing="0" w:after="160" w:afterAutospacing="0"/>
-        <w:jc w:val="center"/>
-        <w:rPr>
-          <w:rFonts w:hint="default" w:ascii="TH SarabunPSK" w:hAnsi="TH SarabunPSK" w:eastAsia="TH SarabunPSK" w:cs="TH SarabunPSK"/>
-          <w:b w:val="0"/>
-          <w:bCs w:val="0"/>
-          <w:sz w:val="32"/>
-          <w:szCs w:val="32"/>
-          <w:lang w:val="en-US"/>
-        </w:rPr>
-      </w:pPr>
-      <w:r>
-        <w:rPr>
-          <w:rFonts w:hint="default" w:ascii="TH SarabunPSK" w:hAnsi="TH SarabunPSK" w:eastAsia="TH SarabunPSK" w:cs="TH SarabunPSK"/>
-          <w:b w:val="0"/>
-          <w:bCs w:val="0"/>
-          <w:sz w:val="32"/>
-          <w:szCs w:val="32"/>
-          <w:lang w:val="en-US"/>
-        </w:rPr>
-        <w:t xml:space="preserve"> </w:t>
-      </w:r>
-    </w:p>
-    <w:p>
-      <w:pPr>
-        <w:spacing w:before="0" w:beforeAutospacing="0" w:after="160" w:afterAutospacing="0"/>
-        <w:jc w:val="center"/>
-        <w:rPr>
-          <w:rFonts w:hint="default" w:ascii="TH SarabunPSK" w:hAnsi="TH SarabunPSK" w:eastAsia="TH SarabunPSK" w:cs="TH SarabunPSK"/>
-          <w:b w:val="0"/>
-          <w:bCs w:val="0"/>
-          <w:sz w:val="32"/>
-          <w:szCs w:val="32"/>
-          <w:lang w:val="en-US"/>
-        </w:rPr>
-      </w:pPr>
-      <w:r>
-        <w:rPr>
-          <w:rFonts w:hint="default" w:ascii="TH SarabunPSK" w:hAnsi="TH SarabunPSK" w:eastAsia="TH SarabunPSK" w:cs="TH SarabunPSK"/>
-          <w:b w:val="0"/>
-          <w:bCs w:val="0"/>
-          <w:sz w:val="32"/>
-          <w:szCs w:val="32"/>
-          <w:lang w:val="en-US"/>
-        </w:rPr>
-        <w:t xml:space="preserve"> </w:t>
-      </w:r>
-    </w:p>
-    <w:p>
-      <w:pPr>
-        <w:spacing w:before="0" w:beforeAutospacing="0" w:after="160" w:afterAutospacing="0"/>
-        <w:jc w:val="center"/>
-        <w:rPr>
-          <w:rFonts w:hint="default" w:ascii="TH SarabunPSK" w:hAnsi="TH SarabunPSK" w:eastAsia="TH SarabunPSK" w:cs="TH SarabunPSK"/>
-          <w:b w:val="0"/>
-          <w:bCs w:val="0"/>
-          <w:sz w:val="32"/>
-          <w:szCs w:val="32"/>
-          <w:lang w:val="en-US"/>
-        </w:rPr>
-      </w:pPr>
-      <w:r>
-        <w:rPr>
-          <w:rFonts w:hint="default" w:ascii="TH SarabunPSK" w:hAnsi="TH SarabunPSK" w:eastAsia="TH SarabunPSK" w:cs="TH SarabunPSK"/>
-          <w:b w:val="0"/>
-          <w:bCs w:val="0"/>
-          <w:sz w:val="32"/>
-          <w:szCs w:val="32"/>
-          <w:lang w:val="en-US"/>
-        </w:rPr>
-        <w:t xml:space="preserve"> </w:t>
-      </w:r>
-    </w:p>
-    <w:p>
-      <w:pPr>
-        <w:spacing w:before="0" w:beforeAutospacing="0" w:after="160" w:afterAutospacing="0"/>
-        <w:jc w:val="center"/>
-        <w:rPr>
-          <w:rFonts w:hint="default" w:ascii="TH SarabunPSK" w:hAnsi="TH SarabunPSK" w:eastAsia="TH SarabunPSK" w:cs="TH SarabunPSK"/>
-          <w:b w:val="0"/>
-          <w:bCs w:val="0"/>
-          <w:sz w:val="32"/>
-          <w:szCs w:val="32"/>
-          <w:lang w:val="en-US"/>
-        </w:rPr>
-      </w:pPr>
-      <w:r>
-        <w:rPr>
-          <w:rFonts w:hint="default" w:ascii="TH SarabunPSK" w:hAnsi="TH SarabunPSK" w:eastAsia="TH SarabunPSK" w:cs="TH SarabunPSK"/>
-          <w:b w:val="0"/>
-          <w:bCs w:val="0"/>
-          <w:sz w:val="32"/>
-          <w:szCs w:val="32"/>
-          <w:lang w:val="en-US"/>
-        </w:rPr>
-        <w:t>ENGCE124</w:t>
-      </w:r>
-    </w:p>
-    <w:p>
-      <w:pPr>
-        <w:spacing w:before="0" w:beforeAutospacing="0" w:after="160" w:afterAutospacing="0"/>
-        <w:jc w:val="center"/>
-        <w:rPr>
-          <w:rFonts w:hint="default" w:ascii="TH SarabunPSK" w:hAnsi="TH SarabunPSK" w:eastAsia="TH SarabunPSK" w:cs="TH SarabunPSK"/>
-          <w:b w:val="0"/>
-          <w:bCs w:val="0"/>
-          <w:sz w:val="32"/>
-          <w:szCs w:val="32"/>
-          <w:lang w:val="en-US"/>
-        </w:rPr>
-      </w:pPr>
-      <w:r>
-        <w:rPr>
-          <w:rFonts w:hint="default" w:ascii="TH SarabunPSK" w:hAnsi="TH SarabunPSK" w:eastAsia="TH SarabunPSK" w:cs="TH SarabunPSK"/>
-          <w:b w:val="0"/>
-          <w:bCs w:val="0"/>
-          <w:sz w:val="32"/>
-          <w:szCs w:val="32"/>
-          <w:lang w:val="en-US"/>
-        </w:rPr>
-        <w:t>(Data Structures and Algorithms)</w:t>
-      </w:r>
     </w:p>
     <w:p>
       <w:pPr>
@@ -1768,8 +1665,6 @@
         </w:rPr>
         <w:br w:type="page"/>
       </w:r>
-      <w:bookmarkStart w:id="0" w:name="_GoBack"/>
-      <w:bookmarkEnd w:id="0"/>
     </w:p>
     <w:p>
       <w:pPr>
@@ -2605,7 +2500,7 @@
                     </pic:cNvPicPr>
                   </pic:nvPicPr>
                   <pic:blipFill>
-                    <a:blip r:embed="rId10"/>
+                    <a:blip r:embed="rId11"/>
                     <a:stretch>
                       <a:fillRect/>
                     </a:stretch>
@@ -2680,7 +2575,7 @@
                     </pic:cNvPicPr>
                   </pic:nvPicPr>
                   <pic:blipFill>
-                    <a:blip r:embed="rId11"/>
+                    <a:blip r:embed="rId12"/>
                     <a:stretch>
                       <a:fillRect/>
                     </a:stretch>
@@ -2809,7 +2704,7 @@
                     </pic:cNvPicPr>
                   </pic:nvPicPr>
                   <pic:blipFill>
-                    <a:blip r:embed="rId12"/>
+                    <a:blip r:embed="rId13"/>
                     <a:stretch>
                       <a:fillRect/>
                     </a:stretch>
@@ -2884,7 +2779,7 @@
                     </pic:cNvPicPr>
                   </pic:nvPicPr>
                   <pic:blipFill>
-                    <a:blip r:embed="rId13"/>
+                    <a:blip r:embed="rId14"/>
                     <a:stretch>
                       <a:fillRect/>
                     </a:stretch>
@@ -2977,7 +2872,7 @@
                     </pic:cNvPicPr>
                   </pic:nvPicPr>
                   <pic:blipFill>
-                    <a:blip r:embed="rId14"/>
+                    <a:blip r:embed="rId15"/>
                     <a:stretch>
                       <a:fillRect/>
                     </a:stretch>
@@ -3052,7 +2947,7 @@
                     </pic:cNvPicPr>
                   </pic:nvPicPr>
                   <pic:blipFill>
-                    <a:blip r:embed="rId15"/>
+                    <a:blip r:embed="rId16"/>
                     <a:stretch>
                       <a:fillRect/>
                     </a:stretch>

</xml_diff>